<commit_message>
chore: programmatically inject placeholders in Form 3, 5, and 28 templates
</commit_message>
<xml_diff>
--- a/patentform-backend-main/demo/src/main/resources/Form-28.docx
+++ b/patentform-backend-main/demo/src/main/resources/Form-28.docx
@@ -1198,7 +1198,7 @@
                 </mc:Choice>
                 <mc:Fallback>
                   <w:pict>
-                    <v:shape id="Textbox 1" o:spid="_x0000_s1026" o:spt="202" type="#_x0000_t202" style="position:absolute;left:0pt;margin-left:5.15pt;margin-top:31.45pt;height:83.55pt;width:519.8pt;mso-position-horizontal-relative:page;mso-position-vertical-relative:page;z-index:251659264;mso-width-relative:page;mso-height-relative:page;" filled="f" stroked="t" coordsize="21600,21600" o:gfxdata="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">
+                    <v:shape id="Textbox 1" o:spid="_x0000_s1026" o:spt="202" type="#_x0000_t202" style="position:absolute;left:0pt;margin-left:5.15pt;margin-top:31.45pt;height:83.55pt;width:519.8pt;mso-position-horizontal-relative:page;mso-position-vertical-relative:page;z-index:251659264;mso-width-relative:page;mso-height-relative:page;" filled="f" stroked="t" coordsize="21600,21600" o:gfxdata="UEsDBAoAAAAAAIdO4kAAAAAAAAAAAAAAAAAEAAAAZHJzL1BLAwQUAAAACACHTuJA7Xf3QdcAAAAK AQAADwAAAGRycy9kb3ducmV2LnhtbE2PzU7DMBCE70i8g7VI3Kjd9EdtiNMDqBIXJEi5cHPjJYmI 18F22+Tt2Z7gtqMZzX5T7EbXizOG2HnSMJ8pEEi1tx01Gj4O+4cNiJgMWdN7Qg0TRtiVtzeFya2/ 0Dueq9QILqGYGw1tSkMuZaxbdCbO/IDE3pcPziSWoZE2mAuXu15mSq2lMx3xh9YM+NRi/V2dnIaf 11XYP492+sRNqN5WtDxM+KL1/d1cPYJIOKa/MFzxGR1KZjr6E9koetZqwUkN62wL4uqr5Zavo4Zs oRTIspD/J5S/UEsDBBQAAAAIAIdO4kDBZGuA6gEAAO8DAAAOAAAAZHJzL2Uyb0RvYy54bWytU9tu 2zAMfR+wfxD0vtgO2qwI4hRtgw4DdgPafYAsy7EASdREJXb+fpTspEX30ofBgEyR9CHPIb25Ha1h RxVQg6t5tSg5U05Cq92+5r+fHz/dcIZRuFYYcKrmJ4X8dvvxw2bwa7WEHkyrAiMQh+vB17yP0a+L AmWvrMAFeOUo2EGwItI17Is2iIHQrSmWZbkqBgitDyAVInl3U5DPiOE9gNB1WqodyINVLk6oQRkR iRL22iPf5m67Tsn4s+tQRWZqTkxjPqkI2U06i+1GrPdB+F7LuQXxnhbecLJCOyp6gdqJKNgh6H+g rJYBELq4kGCLiUhWhFhU5RttnnrhVeZCUqO/iI7/D1b+OP4KTLe0CZw5YWngz2qMDYysSuIMHteU 8+QpK473MKbE2Y/kTJzHLtj0JjaM4iTt6SItYTFJztWqrK5WFJIUq8pVVd5cJ5zi5XMfMH5RYFky ah5odllScfyGcUo9p6RqxqUTwej2URuTL2HfPJjAjoKmfVWmJyOYg/0O7eT+fF2W89jJTcsxuZdn NzWEE0xu7hU+RVLNIkkyUU9WHJtx1qOB9kQyDbRNNcc/BxEUZ+aro3Gl1Tsb4Ww0ZyNE8wB5QRML B3eHCJ3OnFOJCXeuTHuQG5t3Ni3a63vOevlPt38BUEsDBAoAAAAAAIdO4kAAAAAAAAAAAAAAAAAG AAAAX3JlbHMvUEsDBBQAAAAIAIdO4kCKFGY80QAAAJQBAAALAAAAX3JlbHMvLnJlbHOlkMFqwzAM hu+DvYPRfXGawxijTi+j0GvpHsDYimMaW0Yy2fr28w6DZfS2o36h7xP//vCZFrUiS6RsYNf1oDA7 8jEHA++X49MLKKk2e7tQRgM3FDiMjw/7My62tiOZYxHVKFkMzLWWV63FzZisdFQwt81EnGxtIwdd rLvagHro+2fNvxkwbpjq5A3wyQ+gLrfSzH/YKTomoal2jpKmaYruHlUHtmWO7sg24Ru5RrMcsBrw LBoHalnXfgR9X7/7p97TRz7jutV+h4zrj1dvuhy/AFBLAwQUAAAACACHTuJAfublIPcAAADhAQAA EwAAAFtDb250ZW50X1R5cGVzXS54bWyVkUFOwzAQRfdI3MHyFiVOu0AIJemCtEtAqBxgZE8Si2Rs eUxob4+TthtEkVjaM/+/J7vcHMZBTBjYOqrkKi+kQNLOWOoq+b7fZQ9ScAQyMDjCSh6R5aa+vSn3 R48sUpq4kn2M/lEp1j2OwLnzSGnSujBCTMfQKQ/6AzpU66K4V9pRRIpZnDtkXTbYwucQxfaQrk8m AQeW4um0OLMqCd4PVkNMpmoi84OSnQl5Si473FvPd0lDql8J8+Q64Jx7SU8TrEHxCiE+w5g0lAms jPuigFP+d8lsOXLm2tZqzJvATYq94XSxutaOa9c4/d/y7ZK6dKvlg+pvUEsBAhQAFAAAAAgAh07i QH7m5SD3AAAA4QEAABMAAAAAAAAAAQAgAAAAWgQAAFtDb250ZW50X1R5cGVzXS54bWxQSwECFAAK AAAAAACHTuJAAAAAAAAAAAAAAAAABgAAAAAAAAAAABAAAAA8AwAAX3JlbHMvUEsBAhQAFAAAAAgA h07iQIoUZjzRAAAAlAEAAAsAAAAAAAAAAQAgAAAAYAMAAF9yZWxzLy5yZWxzUEsBAhQACgAAAAAA h07iQAAAAAAAAAAAAAAAAAQAAAAAAAAAAAAQAAAAAAAAAGRycy9QSwECFAAUAAAACACHTuJA7Xf3 QdcAAAAKAQAADwAAAAAAAAABACAAAAAiAAAAZHJzL2Rvd25yZXYueG1sUEsBAhQAFAAAAAgAh07i QMFka4DqAQAA7wMAAA4AAAAAAAAAAQAgAAAAJgEAAGRycy9lMm9Eb2MueG1sUEsFBgAAAAAGAAYA WQEAAIIFAAAAAA== ">
                       <v:fill on="f" focussize="0,0"/>
                       <v:stroke color="#404040 [2429]" joinstyle="round"/>
                       <v:imagedata o:title=""/>
@@ -1896,6 +1896,14 @@
             </w:r>
           </w:p>
         </w:tc>
+        <w:tc>
+          <w:p>
+            <w:r>
+              <w:t>1 Insert name, address and nationality.
+I/We {applicantName} ({applicantAddress}) applicant/patentee in respect of the Patent Application No {applicationNo} filed or Patent No {patentNo} hereby declare that I/we am/are an educational institution/small entity and submit the following document(s) as proof:</w:t>
+            </w:r>
+          </w:p>
+        </w:tc>
       </w:tr>
       <w:tr>
         <w:tblPrEx>
@@ -4043,6 +4051,22 @@
                 <w:sz w:val="22"/>
               </w:rPr>
               <w:t>Chennai</w:t>
+            </w:r>
+          </w:p>
+        </w:tc>
+        <w:tc>
+          <w:p>
+            <w:r>
+              <w:t>3 To be signed by the applicant(s) /patentee(s)/ authorized registered patent agent.
+The information provided herein is correct to the best of my/our knowledge and belief.
+Signature: __________________
+Name: {signatureName}
+Designation: Principal
+Organization: {applicantName}
+Dated this {currentDay} day of {currentMonth} {currentYear}
+To,
+The Controller of Patent
+The Patent Office, {patentOfficeBranch}</w:t>
             </w:r>
           </w:p>
         </w:tc>

</xml_diff>